<commit_message>
Add possession delivery installment to reservations export
</commit_message>
<xml_diff>
--- a/src/templates/boleto-template-cuotas-usd.docx
+++ b/src/templates/boleto-template-cuotas-usd.docx
@@ -57,7 +57,183 @@
           <w:szCs w:val="24"/>
           <w:lang w:val="es-ES_tradnl"/>
         </w:rPr>
-        <w:t xml:space="preserve">En la Ciudad Autónoma de Buenos Aires, a los {dia} días del mes de {mes} de {anioLetras}, quienes suscriben, por una parte: 1) MIGUEL ÁNGEL LÁZZARO, argentino, titular del Documento Nacional de Identidad 8.206.039 y del CUIL 20-08206039-2, domiciliado en la calle Ladislao Martínez 243 Piso 2, Localidad de Martínez, Partido de San Isidro, Provincia de Buenos Aires, quien interviene en nombre y representación, en su carácter de Presidente de la Sociedad que gira en esta plaza, bajo la denominación de “BARRIO STEFANI SOCIEDAD ANÓNIMA”, CUIT 30-71917882-7, con sede social en la calle Talcahuano 469, Piso 2, de ésta Ciudad, en adelante denominado “Parte Vendedora"; y por la otra parte: 2) {nombreComprador}, {nacionalidad}, nacido el {fechaNacimientoLetras}, {estadoCivil}, titular del Documento Nacional de Identidad {dniComprador}, CUIT {cuitComprador}, domiciliado en {domicilioComprador}, en adelante denominado "Parte Compradora", y conjuntamente denominadas "Las Partes"; han convenido en celebrar el presente BOLETO DE COMPRA-VENTA INMOBILIARIA, sujeto a las siguientes cláusulas y condiciones: </w:t>
+        <w:t>En la Ciudad Autónoma de Buenos Aires, a los {</w:t>
+      </w:r>
+      <w:proofErr w:type="spellStart"/>
+      <w:r>
+        <w:rPr>
+          <w:rFonts w:ascii="Times New Roman" w:hAnsi="Times New Roman" w:cs="Times New Roman"/>
+          <w:color w:val="000000"/>
+          <w:sz w:val="24"/>
+          <w:szCs w:val="24"/>
+          <w:lang w:val="es-ES_tradnl"/>
+        </w:rPr>
+        <w:t>dia</w:t>
+      </w:r>
+      <w:proofErr w:type="spellEnd"/>
+      <w:r>
+        <w:rPr>
+          <w:rFonts w:ascii="Times New Roman" w:hAnsi="Times New Roman" w:cs="Times New Roman"/>
+          <w:color w:val="000000"/>
+          <w:sz w:val="24"/>
+          <w:szCs w:val="24"/>
+          <w:lang w:val="es-ES_tradnl"/>
+        </w:rPr>
+        <w:t>} días del mes de {mes} de {</w:t>
+      </w:r>
+      <w:proofErr w:type="spellStart"/>
+      <w:r>
+        <w:rPr>
+          <w:rFonts w:ascii="Times New Roman" w:hAnsi="Times New Roman" w:cs="Times New Roman"/>
+          <w:color w:val="000000"/>
+          <w:sz w:val="24"/>
+          <w:szCs w:val="24"/>
+          <w:lang w:val="es-ES_tradnl"/>
+        </w:rPr>
+        <w:t>anioLetras</w:t>
+      </w:r>
+      <w:proofErr w:type="spellEnd"/>
+      <w:r>
+        <w:rPr>
+          <w:rFonts w:ascii="Times New Roman" w:hAnsi="Times New Roman" w:cs="Times New Roman"/>
+          <w:color w:val="000000"/>
+          <w:sz w:val="24"/>
+          <w:szCs w:val="24"/>
+          <w:lang w:val="es-ES_tradnl"/>
+        </w:rPr>
+        <w:t>}, quienes suscriben, por una parte: 1) MIGUEL ÁNGEL LÁZZARO, argentino, titular del Documento Nacional de Identidad 8.206.039 y del CUIL 20-08206039-2, domiciliado en la calle Ladislao Martínez 243 Piso 2, Localidad de Martínez, Partido de San Isidro, Provincia de Buenos Aires, quien interviene en nombre y representación, en su carácter de Presidente de la Sociedad que gira en esta plaza, bajo la denominación de “BARRIO STEFANI SOCIEDAD ANÓNIMA”, CUIT 30-71917882-7, con sede social en la calle Talcahuano 469, Piso 2, de ésta Ciudad, en adelante denominado “Parte Vendedora"; y por la otra parte: 2) {</w:t>
+      </w:r>
+      <w:proofErr w:type="spellStart"/>
+      <w:r>
+        <w:rPr>
+          <w:rFonts w:ascii="Times New Roman" w:hAnsi="Times New Roman" w:cs="Times New Roman"/>
+          <w:color w:val="000000"/>
+          <w:sz w:val="24"/>
+          <w:szCs w:val="24"/>
+          <w:lang w:val="es-ES_tradnl"/>
+        </w:rPr>
+        <w:t>nombreComprador</w:t>
+      </w:r>
+      <w:proofErr w:type="spellEnd"/>
+      <w:r>
+        <w:rPr>
+          <w:rFonts w:ascii="Times New Roman" w:hAnsi="Times New Roman" w:cs="Times New Roman"/>
+          <w:color w:val="000000"/>
+          <w:sz w:val="24"/>
+          <w:szCs w:val="24"/>
+          <w:lang w:val="es-ES_tradnl"/>
+        </w:rPr>
+        <w:t>}, {nacionalidad}, nacido el {</w:t>
+      </w:r>
+      <w:proofErr w:type="spellStart"/>
+      <w:r>
+        <w:rPr>
+          <w:rFonts w:ascii="Times New Roman" w:hAnsi="Times New Roman" w:cs="Times New Roman"/>
+          <w:color w:val="000000"/>
+          <w:sz w:val="24"/>
+          <w:szCs w:val="24"/>
+          <w:lang w:val="es-ES_tradnl"/>
+        </w:rPr>
+        <w:t>fechaNacimientoLetras</w:t>
+      </w:r>
+      <w:proofErr w:type="spellEnd"/>
+      <w:r>
+        <w:rPr>
+          <w:rFonts w:ascii="Times New Roman" w:hAnsi="Times New Roman" w:cs="Times New Roman"/>
+          <w:color w:val="000000"/>
+          <w:sz w:val="24"/>
+          <w:szCs w:val="24"/>
+          <w:lang w:val="es-ES_tradnl"/>
+        </w:rPr>
+        <w:t>}, {</w:t>
+      </w:r>
+      <w:proofErr w:type="spellStart"/>
+      <w:r>
+        <w:rPr>
+          <w:rFonts w:ascii="Times New Roman" w:hAnsi="Times New Roman" w:cs="Times New Roman"/>
+          <w:color w:val="000000"/>
+          <w:sz w:val="24"/>
+          <w:szCs w:val="24"/>
+          <w:lang w:val="es-ES_tradnl"/>
+        </w:rPr>
+        <w:t>estadoCivil</w:t>
+      </w:r>
+      <w:proofErr w:type="spellEnd"/>
+      <w:r>
+        <w:rPr>
+          <w:rFonts w:ascii="Times New Roman" w:hAnsi="Times New Roman" w:cs="Times New Roman"/>
+          <w:color w:val="000000"/>
+          <w:sz w:val="24"/>
+          <w:szCs w:val="24"/>
+          <w:lang w:val="es-ES_tradnl"/>
+        </w:rPr>
+        <w:t>}, titular del Documento Nacional de Identidad {</w:t>
+      </w:r>
+      <w:proofErr w:type="spellStart"/>
+      <w:r>
+        <w:rPr>
+          <w:rFonts w:ascii="Times New Roman" w:hAnsi="Times New Roman" w:cs="Times New Roman"/>
+          <w:color w:val="000000"/>
+          <w:sz w:val="24"/>
+          <w:szCs w:val="24"/>
+          <w:lang w:val="es-ES_tradnl"/>
+        </w:rPr>
+        <w:t>dniComprador</w:t>
+      </w:r>
+      <w:proofErr w:type="spellEnd"/>
+      <w:r>
+        <w:rPr>
+          <w:rFonts w:ascii="Times New Roman" w:hAnsi="Times New Roman" w:cs="Times New Roman"/>
+          <w:color w:val="000000"/>
+          <w:sz w:val="24"/>
+          <w:szCs w:val="24"/>
+          <w:lang w:val="es-ES_tradnl"/>
+        </w:rPr>
+        <w:t>}, CUIT {</w:t>
+      </w:r>
+      <w:proofErr w:type="spellStart"/>
+      <w:r>
+        <w:rPr>
+          <w:rFonts w:ascii="Times New Roman" w:hAnsi="Times New Roman" w:cs="Times New Roman"/>
+          <w:color w:val="000000"/>
+          <w:sz w:val="24"/>
+          <w:szCs w:val="24"/>
+          <w:lang w:val="es-ES_tradnl"/>
+        </w:rPr>
+        <w:t>cuitComprador</w:t>
+      </w:r>
+      <w:proofErr w:type="spellEnd"/>
+      <w:r>
+        <w:rPr>
+          <w:rFonts w:ascii="Times New Roman" w:hAnsi="Times New Roman" w:cs="Times New Roman"/>
+          <w:color w:val="000000"/>
+          <w:sz w:val="24"/>
+          <w:szCs w:val="24"/>
+          <w:lang w:val="es-ES_tradnl"/>
+        </w:rPr>
+        <w:t>}, domiciliado en {</w:t>
+      </w:r>
+      <w:proofErr w:type="spellStart"/>
+      <w:r>
+        <w:rPr>
+          <w:rFonts w:ascii="Times New Roman" w:hAnsi="Times New Roman" w:cs="Times New Roman"/>
+          <w:color w:val="000000"/>
+          <w:sz w:val="24"/>
+          <w:szCs w:val="24"/>
+          <w:lang w:val="es-ES_tradnl"/>
+        </w:rPr>
+        <w:t>domicilioComprador</w:t>
+      </w:r>
+      <w:proofErr w:type="spellEnd"/>
+      <w:r>
+        <w:rPr>
+          <w:rFonts w:ascii="Times New Roman" w:hAnsi="Times New Roman" w:cs="Times New Roman"/>
+          <w:color w:val="000000"/>
+          <w:sz w:val="24"/>
+          <w:szCs w:val="24"/>
+          <w:lang w:val="es-ES_tradnl"/>
+        </w:rPr>
+        <w:t xml:space="preserve">}, en adelante "Parte Compradora", y conjuntamente denominadas "Las Partes"; han convenido en celebrar el presente BOLETO DE COMPRA-VENTA INMOBILIARIA, sujeto a las siguientes cláusulas y condiciones: </w:t>
       </w:r>
     </w:p>
     <w:p>
@@ -99,7 +275,73 @@
           <w:szCs w:val="24"/>
           <w:lang w:val="es-ES_tradnl"/>
         </w:rPr>
-        <w:t>: La parte VENDEDORA VENDE a la PARTE COMPRADORA, el siguiente inmueble de su propiedad: un LOTE ubicado en la Sección IV, en la LOCALIDAD Y PARTIDO DE MORENO, PROVINCIA DE BUENOS AIRES, con frente a la calle {calleInmueble}, entre las calles {limites}, designado según {tituloPlano}, como LOTE {lote} DE LA MANZANA {manzana}, el cual consta de las siguientes medidas, linderos y superficies: {medidas}.- NOMENCLATURA CATASTRAL: Circunscripción V, Sección F, Manzana {manzana}, Parcela {parcelaCatastral}.- PARTIDA INMOBILIARIA: 074-{partida}.- Inscripto su dominio en el Registro de la Propiedad Inmueble en la Matrícula {matricula}</w:t>
+        <w:t>: La parte VENDEDORA VENDE a la PARTE COMPRADORA, el siguiente inmueble de su propiedad: un LOTE ubicado en la Sección IV, en la LOCALIDAD Y PARTIDO DE MORENO, PROVINCIA DE BUENOS AIRES, con frente a la calle {</w:t>
+      </w:r>
+      <w:proofErr w:type="spellStart"/>
+      <w:r>
+        <w:rPr>
+          <w:rFonts w:ascii="Times New Roman" w:hAnsi="Times New Roman" w:cs="Times New Roman"/>
+          <w:color w:val="000000"/>
+          <w:sz w:val="24"/>
+          <w:szCs w:val="24"/>
+          <w:lang w:val="es-ES_tradnl"/>
+        </w:rPr>
+        <w:t>calleInmueble</w:t>
+      </w:r>
+      <w:proofErr w:type="spellEnd"/>
+      <w:r>
+        <w:rPr>
+          <w:rFonts w:ascii="Times New Roman" w:hAnsi="Times New Roman" w:cs="Times New Roman"/>
+          <w:color w:val="000000"/>
+          <w:sz w:val="24"/>
+          <w:szCs w:val="24"/>
+          <w:lang w:val="es-ES_tradnl"/>
+        </w:rPr>
+        <w:t>}, entre las calles {limites}, designado según {</w:t>
+      </w:r>
+      <w:proofErr w:type="spellStart"/>
+      <w:r>
+        <w:rPr>
+          <w:rFonts w:ascii="Times New Roman" w:hAnsi="Times New Roman" w:cs="Times New Roman"/>
+          <w:color w:val="000000"/>
+          <w:sz w:val="24"/>
+          <w:szCs w:val="24"/>
+          <w:lang w:val="es-ES_tradnl"/>
+        </w:rPr>
+        <w:t>tituloPlano</w:t>
+      </w:r>
+      <w:proofErr w:type="spellEnd"/>
+      <w:r>
+        <w:rPr>
+          <w:rFonts w:ascii="Times New Roman" w:hAnsi="Times New Roman" w:cs="Times New Roman"/>
+          <w:color w:val="000000"/>
+          <w:sz w:val="24"/>
+          <w:szCs w:val="24"/>
+          <w:lang w:val="es-ES_tradnl"/>
+        </w:rPr>
+        <w:t>}, como LOTE {lote} DE LA MANZANA {manzana}, el cual consta de las siguientes medidas, linderos y superficies: {medidas}.- NOMENCLATURA CATASTRAL: Circunscripción V, Sección F, Manzana {manzana}, Parcela {</w:t>
+      </w:r>
+      <w:proofErr w:type="spellStart"/>
+      <w:r>
+        <w:rPr>
+          <w:rFonts w:ascii="Times New Roman" w:hAnsi="Times New Roman" w:cs="Times New Roman"/>
+          <w:color w:val="000000"/>
+          <w:sz w:val="24"/>
+          <w:szCs w:val="24"/>
+          <w:lang w:val="es-ES_tradnl"/>
+        </w:rPr>
+        <w:t>parcelaCatastral</w:t>
+      </w:r>
+      <w:proofErr w:type="spellEnd"/>
+      <w:r>
+        <w:rPr>
+          <w:rFonts w:ascii="Times New Roman" w:hAnsi="Times New Roman" w:cs="Times New Roman"/>
+          <w:color w:val="000000"/>
+          <w:sz w:val="24"/>
+          <w:szCs w:val="24"/>
+          <w:lang w:val="es-ES_tradnl"/>
+        </w:rPr>
+        <w:t>}.- PARTIDA INMOBILIARIA: 074-{partida}.- Inscripto su dominio en el Registro de la Propiedad Inmueble en la Matrícula {matricula}</w:t>
       </w:r>
     </w:p>
     <w:p>
@@ -149,7 +391,73 @@
           <w:lang w:val="es-ES_tradnl"/>
         </w:rPr>
         <w:lastRenderedPageBreak/>
-        <w:t>y A., según escritura {escritura} de fecha {fechaEscritura}, pasada ante el Escribano de ésta Ciudad, Sebastián E. Nadela, al folio {folio} del Registro 1.453 a su cargo, cuya Primera Copia se inscribió en el Registro de la Propiedad Inmueble de la Provincia de Buenos Aires, con fecha {fechaEscritura}, en la Matrícula {matriculaSegunda}</w:t>
+        <w:t>y A., según escritura {escritura} de fecha {</w:t>
+      </w:r>
+      <w:proofErr w:type="spellStart"/>
+      <w:r>
+        <w:rPr>
+          <w:rFonts w:ascii="Times New Roman" w:hAnsi="Times New Roman" w:cs="Times New Roman"/>
+          <w:color w:val="000000"/>
+          <w:sz w:val="24"/>
+          <w:szCs w:val="24"/>
+          <w:lang w:val="es-ES_tradnl"/>
+        </w:rPr>
+        <w:t>fechaEscritura</w:t>
+      </w:r>
+      <w:proofErr w:type="spellEnd"/>
+      <w:r>
+        <w:rPr>
+          <w:rFonts w:ascii="Times New Roman" w:hAnsi="Times New Roman" w:cs="Times New Roman"/>
+          <w:color w:val="000000"/>
+          <w:sz w:val="24"/>
+          <w:szCs w:val="24"/>
+          <w:lang w:val="es-ES_tradnl"/>
+        </w:rPr>
+        <w:t>}, pasada ante el Escribano de ésta Ciudad, Sebastián E. Nadela, al folio {folio} del Registro 1.453 a su cargo, cuya Primera Copia se inscribió en el Registro de la Propiedad Inmueble de la Provincia de Buenos Aires, con fecha {</w:t>
+      </w:r>
+      <w:proofErr w:type="spellStart"/>
+      <w:r>
+        <w:rPr>
+          <w:rFonts w:ascii="Times New Roman" w:hAnsi="Times New Roman" w:cs="Times New Roman"/>
+          <w:color w:val="000000"/>
+          <w:sz w:val="24"/>
+          <w:szCs w:val="24"/>
+          <w:lang w:val="es-ES_tradnl"/>
+        </w:rPr>
+        <w:t>fechaEscritura</w:t>
+      </w:r>
+      <w:proofErr w:type="spellEnd"/>
+      <w:r>
+        <w:rPr>
+          <w:rFonts w:ascii="Times New Roman" w:hAnsi="Times New Roman" w:cs="Times New Roman"/>
+          <w:color w:val="000000"/>
+          <w:sz w:val="24"/>
+          <w:szCs w:val="24"/>
+          <w:lang w:val="es-ES_tradnl"/>
+        </w:rPr>
+        <w:t>}, en la Matrícula {</w:t>
+      </w:r>
+      <w:proofErr w:type="spellStart"/>
+      <w:r>
+        <w:rPr>
+          <w:rFonts w:ascii="Times New Roman" w:hAnsi="Times New Roman" w:cs="Times New Roman"/>
+          <w:color w:val="000000"/>
+          <w:sz w:val="24"/>
+          <w:szCs w:val="24"/>
+          <w:lang w:val="es-ES_tradnl"/>
+        </w:rPr>
+        <w:t>matriculaSegunda</w:t>
+      </w:r>
+      <w:proofErr w:type="spellEnd"/>
+      <w:r>
+        <w:rPr>
+          <w:rFonts w:ascii="Times New Roman" w:hAnsi="Times New Roman" w:cs="Times New Roman"/>
+          <w:color w:val="000000"/>
+          <w:sz w:val="24"/>
+          <w:szCs w:val="24"/>
+          <w:lang w:val="es-ES_tradnl"/>
+        </w:rPr>
+        <w:t>}</w:t>
       </w:r>
       <w:r>
         <w:rPr>
@@ -198,7 +506,205 @@
           <w:szCs w:val="24"/>
           <w:lang w:val="es-ES_tradnl"/>
         </w:rPr>
-        <w:t>: Esta venta se realiza por el precio total y convenido de DÓLARES ESTADOUNIDENSES BILLETE {precioTotalPalabras}, (U$S {precioTotalNum}, que la PARTE COMPRADORA abonará a la PARTE VENDEDORA de la siguiente manera: la suma de DÓLARES ESTADOUNIDENSES BILLETE {anticipoPalabras}, (U$S {anticipoNum},) la PARTE COMPRADORA entrega la PARTE VENDEDORA en este acto, en billetes de dicha moneda, a cuenta de precio y como principio de ejecución del contrato, sirviendo el presente de suficiente recibo y carta de pago en forma; y el saldo, es decir, la suma de DÓLARES ESTADOUNIDENSES BILLETE {saldoPalabras}, (U$S {saldoNum},) serán abonados por la PARTE COMPRADORA a la PARTE VENDEDORA EN {cantidadCuotas} CUOTAS, mensuales, iguales y consecutivas de DÓLARES ESTADOUNIDENSES BILLETE {cuotaMensualPalabras}, (U$S {cuotaMensual}),  en billetes de dicha moneda</w:t>
+        <w:t>: Esta venta se realiza por el precio total y convenido de DÓLARES ESTADOUNIDENSES BILLETE {</w:t>
+      </w:r>
+      <w:proofErr w:type="spellStart"/>
+      <w:r>
+        <w:rPr>
+          <w:rFonts w:ascii="Times New Roman" w:hAnsi="Times New Roman" w:cs="Times New Roman"/>
+          <w:color w:val="000000"/>
+          <w:sz w:val="24"/>
+          <w:szCs w:val="24"/>
+          <w:lang w:val="es-ES_tradnl"/>
+        </w:rPr>
+        <w:t>precioTotalPalabras</w:t>
+      </w:r>
+      <w:proofErr w:type="spellEnd"/>
+      <w:r>
+        <w:rPr>
+          <w:rFonts w:ascii="Times New Roman" w:hAnsi="Times New Roman" w:cs="Times New Roman"/>
+          <w:color w:val="000000"/>
+          <w:sz w:val="24"/>
+          <w:szCs w:val="24"/>
+          <w:lang w:val="es-ES_tradnl"/>
+        </w:rPr>
+        <w:t>}, (U$S {</w:t>
+      </w:r>
+      <w:proofErr w:type="spellStart"/>
+      <w:r>
+        <w:rPr>
+          <w:rFonts w:ascii="Times New Roman" w:hAnsi="Times New Roman" w:cs="Times New Roman"/>
+          <w:color w:val="000000"/>
+          <w:sz w:val="24"/>
+          <w:szCs w:val="24"/>
+          <w:lang w:val="es-ES_tradnl"/>
+        </w:rPr>
+        <w:t>precioTotalNum</w:t>
+      </w:r>
+      <w:proofErr w:type="spellEnd"/>
+      <w:r>
+        <w:rPr>
+          <w:rFonts w:ascii="Times New Roman" w:hAnsi="Times New Roman" w:cs="Times New Roman"/>
+          <w:color w:val="000000"/>
+          <w:sz w:val="24"/>
+          <w:szCs w:val="24"/>
+          <w:lang w:val="es-ES_tradnl"/>
+        </w:rPr>
+        <w:t>}, que la PARTE COMPRADORA abonará a la PARTE VENDEDORA de la siguiente manera: la suma de DÓLARES ESTADOUNIDENSES BILLETE {</w:t>
+      </w:r>
+      <w:proofErr w:type="spellStart"/>
+      <w:r>
+        <w:rPr>
+          <w:rFonts w:ascii="Times New Roman" w:hAnsi="Times New Roman" w:cs="Times New Roman"/>
+          <w:color w:val="000000"/>
+          <w:sz w:val="24"/>
+          <w:szCs w:val="24"/>
+          <w:lang w:val="es-ES_tradnl"/>
+        </w:rPr>
+        <w:t>anticipoPalabras</w:t>
+      </w:r>
+      <w:proofErr w:type="spellEnd"/>
+      <w:r>
+        <w:rPr>
+          <w:rFonts w:ascii="Times New Roman" w:hAnsi="Times New Roman" w:cs="Times New Roman"/>
+          <w:color w:val="000000"/>
+          <w:sz w:val="24"/>
+          <w:szCs w:val="24"/>
+          <w:lang w:val="es-ES_tradnl"/>
+        </w:rPr>
+        <w:t>}, (U$S {</w:t>
+      </w:r>
+      <w:proofErr w:type="spellStart"/>
+      <w:r>
+        <w:rPr>
+          <w:rFonts w:ascii="Times New Roman" w:hAnsi="Times New Roman" w:cs="Times New Roman"/>
+          <w:color w:val="000000"/>
+          <w:sz w:val="24"/>
+          <w:szCs w:val="24"/>
+          <w:lang w:val="es-ES_tradnl"/>
+        </w:rPr>
+        <w:t>anticipoNum</w:t>
+      </w:r>
+      <w:proofErr w:type="spellEnd"/>
+      <w:r>
+        <w:rPr>
+          <w:rFonts w:ascii="Times New Roman" w:hAnsi="Times New Roman" w:cs="Times New Roman"/>
+          <w:color w:val="000000"/>
+          <w:sz w:val="24"/>
+          <w:szCs w:val="24"/>
+          <w:lang w:val="es-ES_tradnl"/>
+        </w:rPr>
+        <w:t>},) la PARTE COMPRADORA entrega la PARTE VENDEDORA en este acto, en billetes de dicha moneda, a cuenta de precio y como principio de ejecución del contrato, sirviendo el presente de suficiente recibo y carta de pago en forma; y el saldo, es decir, la suma de DÓLARES ESTADOUNIDENSES BILLETE {</w:t>
+      </w:r>
+      <w:proofErr w:type="spellStart"/>
+      <w:r>
+        <w:rPr>
+          <w:rFonts w:ascii="Times New Roman" w:hAnsi="Times New Roman" w:cs="Times New Roman"/>
+          <w:color w:val="000000"/>
+          <w:sz w:val="24"/>
+          <w:szCs w:val="24"/>
+          <w:lang w:val="es-ES_tradnl"/>
+        </w:rPr>
+        <w:t>saldoPalabras</w:t>
+      </w:r>
+      <w:proofErr w:type="spellEnd"/>
+      <w:r>
+        <w:rPr>
+          <w:rFonts w:ascii="Times New Roman" w:hAnsi="Times New Roman" w:cs="Times New Roman"/>
+          <w:color w:val="000000"/>
+          <w:sz w:val="24"/>
+          <w:szCs w:val="24"/>
+          <w:lang w:val="es-ES_tradnl"/>
+        </w:rPr>
+        <w:t>}, (U$S {</w:t>
+      </w:r>
+      <w:proofErr w:type="spellStart"/>
+      <w:r>
+        <w:rPr>
+          <w:rFonts w:ascii="Times New Roman" w:hAnsi="Times New Roman" w:cs="Times New Roman"/>
+          <w:color w:val="000000"/>
+          <w:sz w:val="24"/>
+          <w:szCs w:val="24"/>
+          <w:lang w:val="es-ES_tradnl"/>
+        </w:rPr>
+        <w:t>saldoNum</w:t>
+      </w:r>
+      <w:proofErr w:type="spellEnd"/>
+      <w:r>
+        <w:rPr>
+          <w:rFonts w:ascii="Times New Roman" w:hAnsi="Times New Roman" w:cs="Times New Roman"/>
+          <w:color w:val="000000"/>
+          <w:sz w:val="24"/>
+          <w:szCs w:val="24"/>
+          <w:lang w:val="es-ES_tradnl"/>
+        </w:rPr>
+        <w:t>},) serán abonados por la PARTE COMPRADORA a la PARTE VENDEDORA EN {</w:t>
+      </w:r>
+      <w:proofErr w:type="spellStart"/>
+      <w:r>
+        <w:rPr>
+          <w:rFonts w:ascii="Times New Roman" w:hAnsi="Times New Roman" w:cs="Times New Roman"/>
+          <w:color w:val="000000"/>
+          <w:sz w:val="24"/>
+          <w:szCs w:val="24"/>
+          <w:lang w:val="es-ES_tradnl"/>
+        </w:rPr>
+        <w:t>cantidadCuotas</w:t>
+      </w:r>
+      <w:proofErr w:type="spellEnd"/>
+      <w:r>
+        <w:rPr>
+          <w:rFonts w:ascii="Times New Roman" w:hAnsi="Times New Roman" w:cs="Times New Roman"/>
+          <w:color w:val="000000"/>
+          <w:sz w:val="24"/>
+          <w:szCs w:val="24"/>
+          <w:lang w:val="es-ES_tradnl"/>
+        </w:rPr>
+        <w:t>} CUOTAS, mensuales, iguales y consecutivas de DÓLARES ESTADOUNIDENSES BILLETE {</w:t>
+      </w:r>
+      <w:proofErr w:type="spellStart"/>
+      <w:r>
+        <w:rPr>
+          <w:rFonts w:ascii="Times New Roman" w:hAnsi="Times New Roman" w:cs="Times New Roman"/>
+          <w:color w:val="000000"/>
+          <w:sz w:val="24"/>
+          <w:szCs w:val="24"/>
+          <w:lang w:val="es-ES_tradnl"/>
+        </w:rPr>
+        <w:t>cuotaMensualPalabras</w:t>
+      </w:r>
+      <w:proofErr w:type="spellEnd"/>
+      <w:r>
+        <w:rPr>
+          <w:rFonts w:ascii="Times New Roman" w:hAnsi="Times New Roman" w:cs="Times New Roman"/>
+          <w:color w:val="000000"/>
+          <w:sz w:val="24"/>
+          <w:szCs w:val="24"/>
+          <w:lang w:val="es-ES_tradnl"/>
+        </w:rPr>
+        <w:t>}, (U$S {</w:t>
+      </w:r>
+      <w:proofErr w:type="spellStart"/>
+      <w:r>
+        <w:rPr>
+          <w:rFonts w:ascii="Times New Roman" w:hAnsi="Times New Roman" w:cs="Times New Roman"/>
+          <w:color w:val="000000"/>
+          <w:sz w:val="24"/>
+          <w:szCs w:val="24"/>
+          <w:lang w:val="es-ES_tradnl"/>
+        </w:rPr>
+        <w:t>cuotaMensual</w:t>
+      </w:r>
+      <w:proofErr w:type="spellEnd"/>
+      <w:r>
+        <w:rPr>
+          <w:rFonts w:ascii="Times New Roman" w:hAnsi="Times New Roman" w:cs="Times New Roman"/>
+          <w:color w:val="000000"/>
+          <w:sz w:val="24"/>
+          <w:szCs w:val="24"/>
+          <w:lang w:val="es-ES_tradnl"/>
+        </w:rPr>
+        <w:t>}),  en billetes de dicha moneda</w:t>
       </w:r>
       <w:r>
         <w:rPr>
@@ -570,7 +1076,73 @@
           <w:szCs w:val="24"/>
           <w:lang w:val="es-ES_tradnl"/>
         </w:rPr>
-        <w:t xml:space="preserve">pago de la cuota N° {numeroCuotaEntrega}, libre de efectos y/u ocupantes y sin oposición de terceros; recibiéndola ésta última de conformidad.-{/entregaCuota}{#entregaAlSaldo}La posesión será entregada por la PARTE </w:t>
+        <w:t xml:space="preserve">pago de la cuota </w:t>
+      </w:r>
+      <w:proofErr w:type="spellStart"/>
+      <w:r>
+        <w:rPr>
+          <w:rFonts w:ascii="Times New Roman" w:hAnsi="Times New Roman" w:cs="Times New Roman"/>
+          <w:color w:val="000000"/>
+          <w:sz w:val="24"/>
+          <w:szCs w:val="24"/>
+          <w:lang w:val="es-ES_tradnl"/>
+        </w:rPr>
+        <w:t>N°</w:t>
+      </w:r>
+      <w:proofErr w:type="spellEnd"/>
+      <w:r>
+        <w:rPr>
+          <w:rFonts w:ascii="Times New Roman" w:hAnsi="Times New Roman" w:cs="Times New Roman"/>
+          <w:color w:val="000000"/>
+          <w:sz w:val="24"/>
+          <w:szCs w:val="24"/>
+          <w:lang w:val="es-ES_tradnl"/>
+        </w:rPr>
+        <w:t xml:space="preserve"> {</w:t>
+      </w:r>
+      <w:proofErr w:type="spellStart"/>
+      <w:r>
+        <w:rPr>
+          <w:rFonts w:ascii="Times New Roman" w:hAnsi="Times New Roman" w:cs="Times New Roman"/>
+          <w:color w:val="000000"/>
+          <w:sz w:val="24"/>
+          <w:szCs w:val="24"/>
+          <w:lang w:val="es-ES_tradnl"/>
+        </w:rPr>
+        <w:t>numeroCuotaEntrega</w:t>
+      </w:r>
+      <w:proofErr w:type="spellEnd"/>
+      <w:r>
+        <w:rPr>
+          <w:rFonts w:ascii="Times New Roman" w:hAnsi="Times New Roman" w:cs="Times New Roman"/>
+          <w:color w:val="000000"/>
+          <w:sz w:val="24"/>
+          <w:szCs w:val="24"/>
+          <w:lang w:val="es-ES_tradnl"/>
+        </w:rPr>
+        <w:t>}, libre de efectos y/u ocupantes y sin oposición de terceros; recibiéndola ésta última de conformidad.-{/</w:t>
+      </w:r>
+      <w:proofErr w:type="spellStart"/>
+      <w:r>
+        <w:rPr>
+          <w:rFonts w:ascii="Times New Roman" w:hAnsi="Times New Roman" w:cs="Times New Roman"/>
+          <w:color w:val="000000"/>
+          <w:sz w:val="24"/>
+          <w:szCs w:val="24"/>
+          <w:lang w:val="es-ES_tradnl"/>
+        </w:rPr>
+        <w:t>entregaCuota</w:t>
+      </w:r>
+      <w:proofErr w:type="spellEnd"/>
+      <w:r>
+        <w:rPr>
+          <w:rFonts w:ascii="Times New Roman" w:hAnsi="Times New Roman" w:cs="Times New Roman"/>
+          <w:color w:val="000000"/>
+          <w:sz w:val="24"/>
+          <w:szCs w:val="24"/>
+          <w:lang w:val="es-ES_tradnl"/>
+        </w:rPr>
+        <w:t xml:space="preserve">}{#entregaAlSaldo}La posesión será entregada por la PARTE </w:t>
       </w:r>
       <w:r>
         <w:rPr>
@@ -581,7 +1153,29 @@
           <w:lang w:val="es-ES_tradnl"/>
         </w:rPr>
         <w:lastRenderedPageBreak/>
-        <w:t xml:space="preserve">VENDEDORA a la PARTE COMPRADORA en oportunidad de suscribirse la escritura traslativa de dominio, libre de efectos y/u ocupantes y sin oposición de terceros; recibiéndola ésta última de conformidad.-{/entregaAlSaldo} </w:t>
+        <w:t>VENDEDORA a la PARTE COMPRADORA en oportunidad de suscribirse la escritura traslativa de dominio, libre de efectos y/u ocupantes y sin oposición de terceros; recibiéndola ésta última de conformidad.-{/</w:t>
+      </w:r>
+      <w:proofErr w:type="spellStart"/>
+      <w:r>
+        <w:rPr>
+          <w:rFonts w:ascii="Times New Roman" w:hAnsi="Times New Roman" w:cs="Times New Roman"/>
+          <w:color w:val="000000"/>
+          <w:sz w:val="24"/>
+          <w:szCs w:val="24"/>
+          <w:lang w:val="es-ES_tradnl"/>
+        </w:rPr>
+        <w:t>entregaAlSaldo</w:t>
+      </w:r>
+      <w:proofErr w:type="spellEnd"/>
+      <w:r>
+        <w:rPr>
+          <w:rFonts w:ascii="Times New Roman" w:hAnsi="Times New Roman" w:cs="Times New Roman"/>
+          <w:color w:val="000000"/>
+          <w:sz w:val="24"/>
+          <w:szCs w:val="24"/>
+          <w:lang w:val="es-ES_tradnl"/>
+        </w:rPr>
+        <w:t xml:space="preserve">} </w:t>
       </w:r>
     </w:p>
     <w:p>
@@ -640,7 +1234,29 @@
           <w:szCs w:val="24"/>
           <w:lang w:val="es-ES_tradnl"/>
         </w:rPr>
-        <w:t xml:space="preserve">, por ante el Escribano Sebastián Ezequiel Nadela, con oficinas en la calle Hipólito Yrigoyen 850, piso 3, oficina 332, de esta Ciudad, Titular del Registro Notarial Nº 1453, teléfonos 4334-1482, email sebastian@escribanianadela.com.ar / ap@escribanianadela.com.ar a quien las partes facultan para hacer las citaciones y emplazamientos de Acto Notarial. La fecha máxima de escrituración prevista podrá prorrogarse en caso que el trámite a realizar en el expediente sucesorio sufriera demoras por causas ajenas a la diligencia de la parte vendedora. Las partes asimismo se obligan a hacer entrega de la documentación correspondiente, como ser títulos originales. El pago de tasas, De corresponder, el impuesto a las ganancias, sellados, impuestos y demás erogaciones emergentes de la escritura traslativa de dominio serán soportados en su totalidad por la PARTE COMPRADORA, incluyendo el pago del impuesto de sellos que pudiera corresponder. </w:t>
+        <w:t xml:space="preserve">, por ante el Escribano Sebastián Ezequiel Nadela, con oficinas en la calle Hipólito Yrigoyen 850, piso 3, oficina 332, de esta Ciudad, Titular del Registro Notarial </w:t>
+      </w:r>
+      <w:proofErr w:type="spellStart"/>
+      <w:r>
+        <w:rPr>
+          <w:rFonts w:ascii="Times New Roman" w:hAnsi="Times New Roman" w:cs="Times New Roman"/>
+          <w:color w:val="000000"/>
+          <w:sz w:val="24"/>
+          <w:szCs w:val="24"/>
+          <w:lang w:val="es-ES_tradnl"/>
+        </w:rPr>
+        <w:t>Nº</w:t>
+      </w:r>
+      <w:proofErr w:type="spellEnd"/>
+      <w:r>
+        <w:rPr>
+          <w:rFonts w:ascii="Times New Roman" w:hAnsi="Times New Roman" w:cs="Times New Roman"/>
+          <w:color w:val="000000"/>
+          <w:sz w:val="24"/>
+          <w:szCs w:val="24"/>
+          <w:lang w:val="es-ES_tradnl"/>
+        </w:rPr>
+        <w:t xml:space="preserve"> 1453, teléfonos 4334-1482, email sebastian@escribanianadela.com.ar / ap@escribanianadela.com.ar a quien las partes facultan para hacer las citaciones y emplazamientos de Acto Notarial. La fecha máxima de escrituración prevista podrá prorrogarse en caso que el trámite a realizar en el expediente sucesorio sufriera demoras por causas ajenas a la diligencia de la parte vendedora. Las partes asimismo se obligan a hacer entrega de la documentación correspondiente, como ser títulos originales. El pago de tasas, De corresponder, el impuesto a las ganancias, sellados, impuestos y demás erogaciones emergentes de la escritura traslativa de dominio serán soportados en su totalidad por la PARTE COMPRADORA, incluyendo el pago del impuesto de sellos que pudiera corresponder. </w:t>
       </w:r>
     </w:p>
     <w:p>

</xml_diff>